<commit_message>
Update HW3 docx with real GitHub links
</commit_message>
<xml_diff>
--- a/11_decision_support/HW3_Qicheng_Fu.docx
+++ b/11_decision_support/HW3_Qicheng_Fu.docx
@@ -346,7 +346,7 @@
           <w:sz w:val="22"/>
           <w:szCs w:val="22"/>
         </w:rPr>
-        <w:t xml:space="preserve">Update the links below with your actual GitHub username and repository name before submitting.</w:t>
+        <w:t xml:space="preserve">All files are in the public repository: https://github.com/qichengf-glitch/SYSEN5381_Lab</w:t>
       </w:r>
     </w:p>
     <w:p>
@@ -493,7 +493,7 @@
                   <w:szCs w:val="18"/>
                   <w:u w:val="single"/>
                 </w:rPr>
-                <w:t xml:space="preserve">https://github.com/&lt;username&gt;/&lt;repo&gt;/blob/main/11_decision_support/hw3_validator.py</w:t>
+                <w:t xml:space="preserve">https://github.com/qichengf-glitch/SYSEN5381_Lab/blob/main/11_decision_support/hw3_validator.py</w:t>
               </w:r>
             </w:hyperlink>
           </w:p>
@@ -555,7 +555,7 @@
                   <w:szCs w:val="18"/>
                   <w:u w:val="single"/>
                 </w:rPr>
-                <w:t xml:space="preserve">https://github.com/&lt;username&gt;/&lt;repo&gt;/blob/main/11_decision_support/hw3_generate_data.py</w:t>
+                <w:t xml:space="preserve">https://github.com/qichengf-glitch/SYSEN5381_Lab/blob/main/11_decision_support/hw3_generate_data.py</w:t>
               </w:r>
             </w:hyperlink>
           </w:p>
@@ -617,7 +617,7 @@
                   <w:szCs w:val="18"/>
                   <w:u w:val="single"/>
                 </w:rPr>
-                <w:t xml:space="preserve">https://github.com/&lt;username&gt;/&lt;repo&gt;/blob/main/11_decision_support/hw3_validation_scores.csv</w:t>
+                <w:t xml:space="preserve">https://github.com/qichengf-glitch/SYSEN5381_Lab/blob/main/11_decision_support/hw3_validation_scores.csv</w:t>
               </w:r>
             </w:hyperlink>
           </w:p>
@@ -679,7 +679,7 @@
                   <w:szCs w:val="18"/>
                   <w:u w:val="single"/>
                 </w:rPr>
-                <w:t xml:space="preserve">https://github.com/&lt;username&gt;/&lt;repo&gt;/blob/main/11_decision_support/hw3_score_comparison.png</w:t>
+                <w:t xml:space="preserve">https://github.com/qichengf-glitch/SYSEN5381_Lab/blob/main/11_decision_support/hw3_score_comparison.png</w:t>
               </w:r>
             </w:hyperlink>
           </w:p>
@@ -741,7 +741,7 @@
                   <w:szCs w:val="18"/>
                   <w:u w:val="single"/>
                 </w:rPr>
-                <w:t xml:space="preserve">https://github.com/&lt;username&gt;/&lt;repo&gt;/blob/main/lab/data/pipeline/task2_summary.txt</w:t>
+                <w:t xml:space="preserve">https://github.com/qichengf-glitch/SYSEN5381_Lab/blob/main/lab/data/pipeline/task2_summary.txt</w:t>
               </w:r>
             </w:hyperlink>
           </w:p>
@@ -803,7 +803,7 @@
                   <w:szCs w:val="18"/>
                   <w:u w:val="single"/>
                 </w:rPr>
-                <w:t xml:space="preserve">https://github.com/&lt;username&gt;/&lt;repo&gt;/blob/main/lab/app.R</w:t>
+                <w:t xml:space="preserve">https://github.com/qichengf-glitch/SYSEN5381_Lab/blob/main/lab/app.R</w:t>
               </w:r>
             </w:hyperlink>
           </w:p>

</xml_diff>